<commit_message>
Huck: revisão Parte 3
Co-Authored-By: Claude Opus 5.5 <noreply@anthropic.com>
Claude-Session: https://claude.ai/code/session_01MJjUEEZrxQDEUifKK2vj9g
</commit_message>
<xml_diff>
--- a/roteiros/luciano-huck/Huck_Parte3.docx
+++ b/roteiros/luciano-huck/Huck_Parte3.docx
@@ -79,7 +79,7 @@
         <w:rPr>
           <w:color w:val="000000"/>
         </w:rPr>
-        <w:t>Depois de um dos encontros entre os dois, Huck mandou uma mensagem.</w:t>
+        <w:t>Depois de uma dessas conversas, Huck mandou uma mensagem.</w:t>
       </w:r>
     </w:p>
     <w:p>
@@ -103,7 +103,7 @@
         <w:rPr>
           <w:color w:val="000000"/>
         </w:rPr>
-        <w:t>O Will Bank passou a patrocinar o Domingão com Huck. E o próprio Luciano Huck virou o rosto da marca. O garoto-propaganda do banco digital de Vorcaro. Nas propagandas, era o rosto dele que convidava o brasileiro a confiar naquela marca.</w:t>
+        <w:t>O Will Bank passou a patrocinar o Domingão com Huck. E o próprio Luciano Huck virou o garoto-propaganda do banco digital de Vorcaro. Nas propagandas, era o rosto dele que convidava o brasileiro a confiar naquela marca.</w:t>
       </w:r>
     </w:p>
     <w:p>
@@ -151,22 +151,6 @@
         <w:rPr>
           <w:color w:val="000000"/>
         </w:rPr>
-        <w:t>Esse dinheiro não ficava com a emissora. Era do apresentador.</w:t>
-      </w:r>
-    </w:p>
-    <w:p>
-      <w:r>
-        <w:rPr>
-          <w:color w:val="000000"/>
-        </w:rPr>
-        <w:t>Um contrato assinado em dezembro de dois mil e vinte e quatro, com o nome de Luciano Huck.</w:t>
-      </w:r>
-    </w:p>
-    <w:p>
-      <w:r>
-        <w:rPr>
-          <w:color w:val="000000"/>
-        </w:rPr>
         <w:t>Para ter uma ideia do que isso significa, pense no salário mínimo daquele ano. Mil quatrocentos e doze reais.</w:t>
       </w:r>
     </w:p>
@@ -191,7 +175,7 @@
         <w:rPr>
           <w:color w:val="000000"/>
         </w:rPr>
-        <w:t>Lembra das famílias que choravam no Caldeirão ao ganhar uma casa reformada? Muitas delas viviam exatamente com isso. Um salário mínimo por mês, às vezes menos.</w:t>
+        <w:t>Lembra das famílias que choravam no Caldeirão ao ganhar uma casa reformada? Muitas daquelas famílias viviam com algo perto disso. Um salário mínimo por mês, às vezes menos.</w:t>
       </w:r>
     </w:p>
     <w:p>
@@ -327,7 +311,7 @@
         <w:rPr>
           <w:color w:val="000000"/>
         </w:rPr>
-        <w:t>Um apresentador da Globo, um banqueiro e o maior jogador brasileiro da sua geração, juntos numa noite de pizza. Era esse o círculo em que Vorcaro estava sendo apresentado.</w:t>
+        <w:t>Um apresentador da Globo, um banqueiro e um dos maiores jogadores da história do Brasil, juntos numa noite de pizza. Era esse o círculo em que Vorcaro estava sendo apresentado.</w:t>
       </w:r>
     </w:p>
     <w:p>
@@ -351,7 +335,15 @@
         <w:rPr>
           <w:color w:val="000000"/>
         </w:rPr>
-        <w:t>Numa das mensagens, Huck dá um conselho direto ao banqueiro.</w:t>
+        <w:t>Com o passar dos meses, a conversa entre os dois foi ficando cada vez mais pessoal. E mais séria.</w:t>
+      </w:r>
+    </w:p>
+    <w:p>
+      <w:r>
+        <w:rPr>
+          <w:color w:val="000000"/>
+        </w:rPr>
+        <w:t>Numa das mensagens, Huck dá um conselho direto ao banqueiro. Repare bem em cada palavra.</w:t>
       </w:r>
     </w:p>
     <w:p>
@@ -447,7 +439,7 @@
         <w:rPr>
           <w:color w:val="1F4EB4"/>
         </w:rPr>
-        <w:t>E o que ele escreveu naquela mensagem, poucas horas antes de o mundo de Vorcaro desabar, é difícil de acreditar até hoje.</w:t>
+        <w:t>E o que ele escreveu naquela mensagem, na noite em que o mundo de Vorcaro desabou, é difícil de acreditar até hoje.</w:t>
       </w:r>
     </w:p>
     <w:sectPr>

</xml_diff>